<commit_message>
Add per-folder reports, multi-folder dialog, and folder picker preview
- _scan_done now generates one report per source folder in results/
- New "Scan Folders" dialog with add/remove folder list (full paths)
- Custom folder picker shows Baseline TDD files via file browser
- 2nd-harmonic autocorrelation check rejects single level-shift events
- Adjacent detections within gap (default 30s) are merged

Co-Authored-By: Claude Opus 4.6 <noreply@anthropic.com>
</commit_message>
<xml_diff>
--- a/doc/Step Noise Notes.docx
+++ b/doc/Step Noise Notes.docx
@@ -249,34 +249,34 @@
             <v:path o:extrusionok="f" gradientshapeok="t" o:connecttype="rect"/>
             <o:lock v:ext="edit" aspectratio="t"/>
           </v:shapetype>
-          <v:shape id="_x0000_i1028" type="#_x0000_t75" style="width:77pt;height:50pt" o:ole="">
+          <v:shape id="_x0000_i1025" type="#_x0000_t75" style="width:77pt;height:49.9pt" o:ole="">
             <v:imagedata r:id="rId8" o:title=""/>
           </v:shape>
-          <o:OLEObject Type="Embed" ProgID="Package" ShapeID="_x0000_i1028" DrawAspect="Icon" ObjectID="_1836569475" r:id="rId9"/>
+          <o:OLEObject Type="Embed" ProgID="Package" ShapeID="_x0000_i1025" DrawAspect="Icon" ObjectID="_1836992990" r:id="rId9"/>
         </w:object>
       </w:r>
       <w:r>
         <w:object w:dxaOrig="1539" w:dyaOrig="997" w14:anchorId="17300A7A">
-          <v:shape id="_x0000_i1027" type="#_x0000_t75" style="width:77pt;height:50pt" o:ole="">
+          <v:shape id="_x0000_i1026" type="#_x0000_t75" style="width:77pt;height:49.9pt" o:ole="">
             <v:imagedata r:id="rId10" o:title=""/>
           </v:shape>
-          <o:OLEObject Type="Embed" ProgID="Package" ShapeID="_x0000_i1027" DrawAspect="Icon" ObjectID="_1836569476" r:id="rId11"/>
+          <o:OLEObject Type="Embed" ProgID="Package" ShapeID="_x0000_i1026" DrawAspect="Icon" ObjectID="_1836992991" r:id="rId11"/>
         </w:object>
       </w:r>
       <w:r>
         <w:object w:dxaOrig="1539" w:dyaOrig="997" w14:anchorId="301914AC">
-          <v:shape id="_x0000_i1025" type="#_x0000_t75" style="width:77pt;height:50pt" o:ole="">
+          <v:shape id="_x0000_i1027" type="#_x0000_t75" style="width:77pt;height:49.9pt" o:ole="">
             <v:imagedata r:id="rId12" o:title=""/>
           </v:shape>
-          <o:OLEObject Type="Embed" ProgID="Package" ShapeID="_x0000_i1025" DrawAspect="Icon" ObjectID="_1836569477" r:id="rId13"/>
+          <o:OLEObject Type="Embed" ProgID="Package" ShapeID="_x0000_i1027" DrawAspect="Icon" ObjectID="_1836992992" r:id="rId13"/>
         </w:object>
       </w:r>
       <w:r>
         <w:object w:dxaOrig="1539" w:dyaOrig="997" w14:anchorId="5BA99304">
-          <v:shape id="_x0000_i1031" type="#_x0000_t75" style="width:77pt;height:50pt" o:ole="">
+          <v:shape id="_x0000_i1028" type="#_x0000_t75" style="width:77pt;height:49.9pt" o:ole="">
             <v:imagedata r:id="rId14" o:title=""/>
           </v:shape>
-          <o:OLEObject Type="Embed" ProgID="Package" ShapeID="_x0000_i1031" DrawAspect="Icon" ObjectID="_1836569478" r:id="rId15"/>
+          <o:OLEObject Type="Embed" ProgID="Package" ShapeID="_x0000_i1028" DrawAspect="Icon" ObjectID="_1836992993" r:id="rId15"/>
         </w:object>
       </w:r>
     </w:p>
@@ -336,6 +336,9 @@
     </w:p>
     <w:p>
       <w:r>
+        <w:rPr>
+          <w:noProof/>
+        </w:rPr>
         <w:lastRenderedPageBreak/>
         <w:drawing>
           <wp:inline distT="0" distB="0" distL="0" distR="0" wp14:anchorId="1688E949" wp14:editId="148D881C">
@@ -376,8 +379,103 @@
     </w:p>
     <w:p/>
     <w:p>
+      <w:hyperlink r:id="rId18" w:history="1">
+        <w:r>
+          <w:rPr>
+            <w:rStyle w:val="Hyperlink"/>
+          </w:rPr>
+          <w:t>\\higgs\Uno256Data\Samples\BspQI_BssSI\24385\HAK04-010A-02L66628w06-433C13a\2026-03-27</w:t>
+        </w:r>
+      </w:hyperlink>
+    </w:p>
+    <w:p/>
+    <w:p/>
+    <w:p/>
+    <w:p>
       <w:r>
-        <w:t>\\higgs\Uno256Data\Samples\BspQI_BssSI\24385\HAK04-010A-02L66628w06-433C13a\2026-03-27</w:t>
+        <w:rPr>
+          <w:noProof/>
+        </w:rPr>
+        <w:lastRenderedPageBreak/>
+        <w:drawing>
+          <wp:inline distT="0" distB="0" distL="0" distR="0" wp14:anchorId="12F4C635" wp14:editId="6DEA29BE">
+            <wp:extent cx="5943600" cy="3926840"/>
+            <wp:effectExtent l="0" t="0" r="0" b="0"/>
+            <wp:docPr id="181195135" name="Picture 1"/>
+            <wp:cNvGraphicFramePr>
+              <a:graphicFrameLocks xmlns:a="http://schemas.openxmlformats.org/drawingml/2006/main" noChangeAspect="1"/>
+            </wp:cNvGraphicFramePr>
+            <a:graphic xmlns:a="http://schemas.openxmlformats.org/drawingml/2006/main">
+              <a:graphicData uri="http://schemas.openxmlformats.org/drawingml/2006/picture">
+                <pic:pic xmlns:pic="http://schemas.openxmlformats.org/drawingml/2006/picture">
+                  <pic:nvPicPr>
+                    <pic:cNvPr id="181195135" name=""/>
+                    <pic:cNvPicPr/>
+                  </pic:nvPicPr>
+                  <pic:blipFill>
+                    <a:blip r:embed="rId19"/>
+                    <a:stretch>
+                      <a:fillRect/>
+                    </a:stretch>
+                  </pic:blipFill>
+                  <pic:spPr>
+                    <a:xfrm>
+                      <a:off x="0" y="0"/>
+                      <a:ext cx="5943600" cy="3926840"/>
+                    </a:xfrm>
+                    <a:prstGeom prst="rect">
+                      <a:avLst/>
+                    </a:prstGeom>
+                  </pic:spPr>
+                </pic:pic>
+              </a:graphicData>
+            </a:graphic>
+          </wp:inline>
+        </w:drawing>
+      </w:r>
+    </w:p>
+    <w:p/>
+    <w:p/>
+    <w:p>
+      <w:r>
+        <w:rPr>
+          <w:noProof/>
+        </w:rPr>
+        <w:drawing>
+          <wp:inline distT="0" distB="0" distL="0" distR="0" wp14:anchorId="390AB8BD" wp14:editId="5D8E4B48">
+            <wp:extent cx="5943600" cy="2599055"/>
+            <wp:effectExtent l="0" t="0" r="0" b="0"/>
+            <wp:docPr id="1083828217" name="Picture 1"/>
+            <wp:cNvGraphicFramePr>
+              <a:graphicFrameLocks xmlns:a="http://schemas.openxmlformats.org/drawingml/2006/main" noChangeAspect="1"/>
+            </wp:cNvGraphicFramePr>
+            <a:graphic xmlns:a="http://schemas.openxmlformats.org/drawingml/2006/main">
+              <a:graphicData uri="http://schemas.openxmlformats.org/drawingml/2006/picture">
+                <pic:pic xmlns:pic="http://schemas.openxmlformats.org/drawingml/2006/picture">
+                  <pic:nvPicPr>
+                    <pic:cNvPr id="1083828217" name=""/>
+                    <pic:cNvPicPr/>
+                  </pic:nvPicPr>
+                  <pic:blipFill>
+                    <a:blip r:embed="rId20"/>
+                    <a:stretch>
+                      <a:fillRect/>
+                    </a:stretch>
+                  </pic:blipFill>
+                  <pic:spPr>
+                    <a:xfrm>
+                      <a:off x="0" y="0"/>
+                      <a:ext cx="5943600" cy="2599055"/>
+                    </a:xfrm>
+                    <a:prstGeom prst="rect">
+                      <a:avLst/>
+                    </a:prstGeom>
+                  </pic:spPr>
+                </pic:pic>
+              </a:graphicData>
+            </a:graphic>
+          </wp:inline>
+        </w:drawing>
       </w:r>
     </w:p>
     <w:sectPr>

</xml_diff>